<commit_message>
docs: reorder authors — Indri Anjar Kartika Sari as first author
- IAKS (UPNVJT) → first author + corresponding author
- DWTS (UNIMUS) → second author
- MK (UNIMUS) → third author (supervisor)
- Contributions updated accordingly
</commit_message>
<xml_diff>
--- a/TELADAN_Dyah_CDK46_Protocol_v20261020.docx
+++ b/TELADAN_Dyah_CDK46_Protocol_v20261020.docx
@@ -746,7 +746,7 @@
           <w:b/>
           <w:sz w:val="20"/>
         </w:rPr>
-        <w:t>Dyah Wahyu Tanjung Sari¹ (DWTS)</w:t>
+        <w:t>Indri Anjar Kartika Sari¹ (IAKS)</w:t>
       </w:r>
     </w:p>
     <w:p>
@@ -757,7 +757,7 @@
         <w:rPr>
           <w:sz w:val="20"/>
         </w:rPr>
-        <w:t>NIM: 16112630009</w:t>
+        <w:t>NIM: 25067020011</w:t>
       </w:r>
     </w:p>
     <w:p>
@@ -768,18 +768,7 @@
         <w:rPr>
           <w:sz w:val="20"/>
         </w:rPr>
-        <w:t>Program Studi Magister Ilmu Laboratorium Klinik</w:t>
-      </w:r>
-    </w:p>
-    <w:p>
-      <w:pPr>
-        <w:spacing w:after="60"/>
-      </w:pPr>
-      <w:r>
-        <w:rPr>
-          <w:sz w:val="20"/>
-        </w:rPr>
-        <w:t>Email: —</w:t>
+        <w:t>Email: 25067020011@student.upnjatim.ac.id</w:t>
       </w:r>
     </w:p>
     <w:p>
@@ -802,7 +791,7 @@
           <w:b/>
           <w:sz w:val="20"/>
         </w:rPr>
-        <w:t>Mudyawati Kamaruddin, S.Si., M.Kes., Ph.D.¹ (MK)</w:t>
+        <w:t>Dyah Wahyu Tanjung Sari² (DWTS)</w:t>
       </w:r>
     </w:p>
     <w:p>
@@ -813,7 +802,7 @@
         <w:rPr>
           <w:sz w:val="20"/>
         </w:rPr>
-        <w:t>NIDN: 0906037402</w:t>
+        <w:t>NIM: 16112630009</w:t>
       </w:r>
     </w:p>
     <w:p>
@@ -824,7 +813,7 @@
         <w:rPr>
           <w:sz w:val="20"/>
         </w:rPr>
-        <w:t>Email: mudyawati@unimus.ac.id</w:t>
+        <w:t>Program Studi Magister Ilmu Laboratorium Klinik</w:t>
       </w:r>
     </w:p>
     <w:p>
@@ -847,7 +836,7 @@
           <w:b/>
           <w:sz w:val="20"/>
         </w:rPr>
-        <w:t>Indri Anjar Kartika Sari² (IAKS)</w:t>
+        <w:t>Mudyawati Kamaruddin, S.Si., M.Kes., Ph.D.² (MK)</w:t>
       </w:r>
     </w:p>
     <w:p>
@@ -858,7 +847,7 @@
         <w:rPr>
           <w:sz w:val="20"/>
         </w:rPr>
-        <w:t>NIM: 25067020011</w:t>
+        <w:t>NIDN: 0906037402</w:t>
       </w:r>
     </w:p>
     <w:p>
@@ -869,7 +858,7 @@
         <w:rPr>
           <w:sz w:val="20"/>
         </w:rPr>
-        <w:t>Email: 25067020011@student.upnjatim.ac.id</w:t>
+        <w:t>Email: mudyawati@unimus.ac.id</w:t>
       </w:r>
     </w:p>
     <w:p>
@@ -903,7 +892,7 @@
         <w:rPr>
           <w:sz w:val="20"/>
         </w:rPr>
-        <w:t>¹ Universitas Muhammadiyah Semarang (UNIMUS), Semarang, Indonesia</w:t>
+        <w:t>¹ Universitas Pembangunan Nasional Veteran Jawa Timur (UPNVJT), Surabaya, Indonesia</w:t>
       </w:r>
     </w:p>
     <w:p>
@@ -914,7 +903,7 @@
         <w:rPr>
           <w:sz w:val="20"/>
         </w:rPr>
-        <w:t>² Universitas Pembangunan Nasional Veteran Jawa Timur (UPNVJT), Surabaya, Indonesia</w:t>
+        <w:t>² Universitas Muhammadiyah Semarang (UNIMUS), Semarang, Indonesia</w:t>
       </w:r>
     </w:p>
     <w:p>
@@ -936,7 +925,18 @@
         <w:rPr>
           <w:sz w:val="20"/>
         </w:rPr>
-        <w:t>Corresponding author: Dyah Wahyu Tanjung Sari</w:t>
+        <w:t>Corresponding author: Indri Anjar Kartika Sari (25067020011@student.upnjatim.ac.id)</w:t>
+      </w:r>
+    </w:p>
+    <w:p>
+      <w:pPr>
+        <w:spacing w:after="60"/>
+      </w:pPr>
+      <w:r>
+        <w:rPr>
+          <w:sz w:val="20"/>
+        </w:rPr>
+        <w:t/>
       </w:r>
     </w:p>
     <w:tbl>
@@ -9159,40 +9159,40 @@
     </w:p>
     <w:p>
       <w:pPr>
-        <w:spacing w:after="120" w:line="276"/>
+        <w:spacing w:after="60"/>
       </w:pPr>
       <w:r>
         <w:rPr>
           <w:sz w:val="20"/>
         </w:rPr>
-        <w:t>Dyah Wahyu Tanjung Sari (DWTS): Conceptualization; Methodology; Investigation; Data curation; Writing – original draft.</w:t>
-      </w:r>
-    </w:p>
-    <w:p>
-      <w:pPr>
-        <w:spacing w:after="120" w:line="276"/>
+        <w:t>Indri Anjar Kartika Sari (IAKS): Conceptualization; Investigation; Data curation; Formal analysis; Visualization; Writing – original draft.</w:t>
+      </w:r>
+    </w:p>
+    <w:p>
+      <w:pPr>
+        <w:spacing w:after="60"/>
       </w:pPr>
       <w:r>
         <w:rPr>
           <w:sz w:val="20"/>
         </w:rPr>
+        <w:t>Dyah Wahyu Tanjung Sari (DWTS): Methodology; Investigation; Data curation; Writing – review and editing.</w:t>
+      </w:r>
+    </w:p>
+    <w:p>
+      <w:pPr>
+        <w:spacing w:after="60"/>
+      </w:pPr>
+      <w:r>
+        <w:rPr>
+          <w:sz w:val="20"/>
+        </w:rPr>
         <w:t>Mudyawati Kamaruddin (MK): Supervision; Validation; Methodology; Writing – review and editing.</w:t>
       </w:r>
     </w:p>
     <w:p>
       <w:pPr>
-        <w:spacing w:after="120" w:line="276"/>
-      </w:pPr>
-      <w:r>
-        <w:rPr>
-          <w:sz w:val="20"/>
-        </w:rPr>
-        <w:t>Indri Anjar Kartika Sari (IAKS): Investigation; Data curation; Formal analysis; Visualization; Writing – review and editing.</w:t>
-      </w:r>
-    </w:p>
-    <w:p>
-      <w:pPr>
-        <w:spacing w:after="120" w:line="276"/>
+        <w:spacing w:after="60"/>
       </w:pPr>
       <w:r>
         <w:rPr>

</xml_diff>